<commit_message>
finish basic organization and test in project two computers connect by copper cabe
</commit_message>
<xml_diff>
--- a/001 - estudo pessoal/004 - Conexao entre 2 computadores/Manual Passo a Passo de Conexao entre 2 computadores.docx
+++ b/001 - estudo pessoal/004 - Conexao entre 2 computadores/Manual Passo a Passo de Conexao entre 2 computadores.docx
@@ -598,9 +598,9 @@
       </w:pPr>
       <w:r>
         <w:drawing>
-          <wp:inline distT="0" distB="0" distL="0" distR="0" wp14:anchorId="13DBFDB3" wp14:editId="6CF92004">
-            <wp:extent cx="4752975" cy="3797238"/>
-            <wp:effectExtent l="0" t="0" r="0" b="0"/>
+          <wp:inline distT="0" distB="0" distL="0" distR="0" wp14:anchorId="13DBFDB3" wp14:editId="70F2A1C3">
+            <wp:extent cx="3743627" cy="2990850"/>
+            <wp:effectExtent l="0" t="0" r="9525" b="0"/>
             <wp:docPr id="900212889" name="Picture 1"/>
             <wp:cNvGraphicFramePr>
               <a:graphicFrameLocks xmlns:a="http://schemas.openxmlformats.org/drawingml/2006/main" noChangeAspect="1"/>
@@ -621,7 +621,7 @@
                   <pic:spPr>
                     <a:xfrm>
                       <a:off x="0" y="0"/>
-                      <a:ext cx="4756463" cy="3800024"/>
+                      <a:ext cx="3750483" cy="2996327"/>
                     </a:xfrm>
                     <a:prstGeom prst="rect">
                       <a:avLst/>
@@ -648,11 +648,10 @@
         <w:jc w:val="center"/>
       </w:pPr>
       <w:r>
-        <w:lastRenderedPageBreak/>
         <w:drawing>
-          <wp:inline distT="0" distB="0" distL="0" distR="0" wp14:anchorId="6CC7FD09" wp14:editId="3AF4D559">
-            <wp:extent cx="4878679" cy="3838575"/>
-            <wp:effectExtent l="0" t="0" r="0" b="0"/>
+          <wp:inline distT="0" distB="0" distL="0" distR="0" wp14:anchorId="6CC7FD09" wp14:editId="062A80A0">
+            <wp:extent cx="3886200" cy="3057686"/>
+            <wp:effectExtent l="0" t="0" r="0" b="9525"/>
             <wp:docPr id="1774788536" name="Picture 1"/>
             <wp:cNvGraphicFramePr>
               <a:graphicFrameLocks xmlns:a="http://schemas.openxmlformats.org/drawingml/2006/main" noChangeAspect="1"/>
@@ -673,7 +672,7 @@
                   <pic:spPr>
                     <a:xfrm>
                       <a:off x="0" y="0"/>
-                      <a:ext cx="4881102" cy="3840482"/>
+                      <a:ext cx="3892687" cy="3062790"/>
                     </a:xfrm>
                     <a:prstGeom prst="rect">
                       <a:avLst/>
@@ -691,9 +690,9 @@
         <w:t>Apos realizar a conexao direta usando o cabo de cooper cross over cabe, sera necessario dar um endereco IP para ambos os computadores para estabelecer uma comunicacao pratica</w:t>
       </w:r>
     </w:p>
-    <w:p/>
-    <w:p>
-      <w:r>
+    <w:p>
+      <w:r>
+        <w:lastRenderedPageBreak/>
         <w:t xml:space="preserve">3 – </w:t>
       </w:r>
       <w:r>
@@ -757,7 +756,6 @@
         <w:jc w:val="center"/>
       </w:pPr>
       <w:r>
-        <w:lastRenderedPageBreak/>
         <w:drawing>
           <wp:inline distT="0" distB="0" distL="0" distR="0" wp14:anchorId="1275CE5A" wp14:editId="45BE0C12">
             <wp:extent cx="5143500" cy="3197147"/>
@@ -796,8 +794,15 @@
       </w:r>
     </w:p>
     <w:p/>
-    <w:p>
-      <w:r>
+    <w:p/>
+    <w:p/>
+    <w:p/>
+    <w:p/>
+    <w:p/>
+    <w:p/>
+    <w:p>
+      <w:r>
+        <w:lastRenderedPageBreak/>
         <w:t xml:space="preserve">5 – </w:t>
       </w:r>
       <w:r>
@@ -810,9 +815,9 @@
       </w:pPr>
       <w:r>
         <w:drawing>
-          <wp:inline distT="0" distB="0" distL="0" distR="0" wp14:anchorId="58BE6B0F" wp14:editId="0216FE82">
-            <wp:extent cx="5010150" cy="3853055"/>
-            <wp:effectExtent l="0" t="0" r="0" b="0"/>
+          <wp:inline distT="0" distB="0" distL="0" distR="0" wp14:anchorId="58BE6B0F" wp14:editId="65B5947C">
+            <wp:extent cx="5746832" cy="4419600"/>
+            <wp:effectExtent l="0" t="0" r="6350" b="0"/>
             <wp:docPr id="1276886971" name="Picture 1"/>
             <wp:cNvGraphicFramePr>
               <a:graphicFrameLocks xmlns:a="http://schemas.openxmlformats.org/drawingml/2006/main" noChangeAspect="1"/>
@@ -833,7 +838,7 @@
                   <pic:spPr>
                     <a:xfrm>
                       <a:off x="0" y="0"/>
-                      <a:ext cx="5013337" cy="3855506"/>
+                      <a:ext cx="5756830" cy="4427289"/>
                     </a:xfrm>
                     <a:prstGeom prst="rect">
                       <a:avLst/>
@@ -847,6 +852,18 @@
       </w:r>
     </w:p>
     <w:p/>
+    <w:p/>
+    <w:p/>
+    <w:p/>
+    <w:p/>
+    <w:p/>
+    <w:p/>
+    <w:p/>
+    <w:p/>
+    <w:p/>
+    <w:p/>
+    <w:p/>
+    <w:p/>
     <w:p>
       <w:r>
         <w:lastRenderedPageBreak/>
@@ -862,9 +879,9 @@
       </w:pPr>
       <w:r>
         <w:drawing>
-          <wp:inline distT="0" distB="0" distL="0" distR="0" wp14:anchorId="5B990A4A" wp14:editId="420A2EF5">
-            <wp:extent cx="5067300" cy="4665682"/>
-            <wp:effectExtent l="0" t="0" r="0" b="1905"/>
+          <wp:inline distT="0" distB="0" distL="0" distR="0" wp14:anchorId="5B990A4A" wp14:editId="2D1995FC">
+            <wp:extent cx="5658664" cy="5210175"/>
+            <wp:effectExtent l="0" t="0" r="0" b="0"/>
             <wp:docPr id="1312390353" name="Picture 1"/>
             <wp:cNvGraphicFramePr>
               <a:graphicFrameLocks xmlns:a="http://schemas.openxmlformats.org/drawingml/2006/main" noChangeAspect="1"/>
@@ -885,7 +902,7 @@
                   <pic:spPr>
                     <a:xfrm>
                       <a:off x="0" y="0"/>
-                      <a:ext cx="5069690" cy="4667882"/>
+                      <a:ext cx="5666324" cy="5217228"/>
                     </a:xfrm>
                     <a:prstGeom prst="rect">
                       <a:avLst/>
@@ -903,9 +920,50 @@
         <w:jc w:val="center"/>
       </w:pPr>
     </w:p>
-    <w:p/>
-    <w:p>
-      <w:r>
+    <w:p>
+      <w:pPr>
+        <w:jc w:val="center"/>
+      </w:pPr>
+    </w:p>
+    <w:p>
+      <w:pPr>
+        <w:jc w:val="center"/>
+      </w:pPr>
+    </w:p>
+    <w:p>
+      <w:pPr>
+        <w:jc w:val="center"/>
+      </w:pPr>
+    </w:p>
+    <w:p>
+      <w:pPr>
+        <w:jc w:val="center"/>
+      </w:pPr>
+    </w:p>
+    <w:p>
+      <w:pPr>
+        <w:jc w:val="center"/>
+      </w:pPr>
+    </w:p>
+    <w:p>
+      <w:pPr>
+        <w:jc w:val="center"/>
+      </w:pPr>
+    </w:p>
+    <w:p>
+      <w:pPr>
+        <w:jc w:val="center"/>
+      </w:pPr>
+    </w:p>
+    <w:p>
+      <w:pPr>
+        <w:jc w:val="center"/>
+      </w:pPr>
+    </w:p>
+    <w:p/>
+    <w:p>
+      <w:r>
+        <w:lastRenderedPageBreak/>
         <w:t xml:space="preserve">7 – </w:t>
       </w:r>
       <w:r>
@@ -917,10 +975,9 @@
         <w:jc w:val="center"/>
       </w:pPr>
       <w:r>
-        <w:lastRenderedPageBreak/>
         <w:drawing>
-          <wp:inline distT="0" distB="0" distL="0" distR="0" wp14:anchorId="64988C15" wp14:editId="7A3A285A">
-            <wp:extent cx="4933950" cy="4421641"/>
+          <wp:inline distT="0" distB="0" distL="0" distR="0" wp14:anchorId="64988C15" wp14:editId="4E143373">
+            <wp:extent cx="5399331" cy="4838700"/>
             <wp:effectExtent l="0" t="0" r="0" b="0"/>
             <wp:docPr id="1364554420" name="Picture 1"/>
             <wp:cNvGraphicFramePr>
@@ -942,7 +999,7 @@
                   <pic:spPr>
                     <a:xfrm>
                       <a:off x="0" y="0"/>
-                      <a:ext cx="4936068" cy="4423539"/>
+                      <a:ext cx="5409556" cy="4847863"/>
                     </a:xfrm>
                     <a:prstGeom prst="rect">
                       <a:avLst/>
@@ -956,8 +1013,18 @@
       </w:r>
     </w:p>
     <w:p/>
-    <w:p>
-      <w:r>
+    <w:p/>
+    <w:p/>
+    <w:p/>
+    <w:p/>
+    <w:p/>
+    <w:p/>
+    <w:p/>
+    <w:p/>
+    <w:p/>
+    <w:p>
+      <w:r>
+        <w:lastRenderedPageBreak/>
         <w:t xml:space="preserve">8 – </w:t>
       </w:r>
       <w:r>
@@ -972,7 +1039,6 @@
         <w:jc w:val="center"/>
       </w:pPr>
       <w:r>
-        <w:lastRenderedPageBreak/>
         <w:drawing>
           <wp:inline distT="0" distB="0" distL="0" distR="0" wp14:anchorId="65ED64F4" wp14:editId="7F62140D">
             <wp:extent cx="4029075" cy="3554342"/>
@@ -1071,11 +1137,10 @@
         <w:jc w:val="center"/>
       </w:pPr>
       <w:r>
-        <w:lastRenderedPageBreak/>
         <w:drawing>
-          <wp:inline distT="0" distB="0" distL="0" distR="0" wp14:anchorId="21449DB4" wp14:editId="04EA5681">
-            <wp:extent cx="4981575" cy="4447333"/>
-            <wp:effectExtent l="0" t="0" r="0" b="0"/>
+          <wp:inline distT="0" distB="0" distL="0" distR="0" wp14:anchorId="21449DB4" wp14:editId="3A4EB9E5">
+            <wp:extent cx="5676016" cy="5067300"/>
+            <wp:effectExtent l="0" t="0" r="1270" b="0"/>
             <wp:docPr id="330179602" name="Picture 1"/>
             <wp:cNvGraphicFramePr>
               <a:graphicFrameLocks xmlns:a="http://schemas.openxmlformats.org/drawingml/2006/main" noChangeAspect="1"/>
@@ -1096,7 +1161,7 @@
                   <pic:spPr>
                     <a:xfrm>
                       <a:off x="0" y="0"/>
-                      <a:ext cx="4983737" cy="4449263"/>
+                      <a:ext cx="5685935" cy="5076155"/>
                     </a:xfrm>
                     <a:prstGeom prst="rect">
                       <a:avLst/>
@@ -1115,8 +1180,12 @@
     <w:p/>
     <w:p/>
     <w:p/>
-    <w:p>
-      <w:r>
+    <w:p/>
+    <w:p/>
+    <w:p/>
+    <w:p>
+      <w:r>
+        <w:lastRenderedPageBreak/>
         <w:t xml:space="preserve">10 – </w:t>
       </w:r>
       <w:r>
@@ -1128,11 +1197,10 @@
         <w:jc w:val="center"/>
       </w:pPr>
       <w:r>
-        <w:lastRenderedPageBreak/>
         <w:drawing>
-          <wp:inline distT="0" distB="0" distL="0" distR="0" wp14:anchorId="53ED61C5" wp14:editId="20243A45">
-            <wp:extent cx="5010150" cy="4678457"/>
-            <wp:effectExtent l="0" t="0" r="0" b="8255"/>
+          <wp:inline distT="0" distB="0" distL="0" distR="0" wp14:anchorId="53ED61C5" wp14:editId="420E7EE7">
+            <wp:extent cx="5406161" cy="5048250"/>
+            <wp:effectExtent l="0" t="0" r="4445" b="0"/>
             <wp:docPr id="1267290030" name="Picture 1"/>
             <wp:cNvGraphicFramePr>
               <a:graphicFrameLocks xmlns:a="http://schemas.openxmlformats.org/drawingml/2006/main" noChangeAspect="1"/>
@@ -1153,7 +1221,7 @@
                   <pic:spPr>
                     <a:xfrm>
                       <a:off x="0" y="0"/>
-                      <a:ext cx="5015219" cy="4683190"/>
+                      <a:ext cx="5417152" cy="5058513"/>
                     </a:xfrm>
                     <a:prstGeom prst="rect">
                       <a:avLst/>
@@ -1168,12 +1236,69 @@
     </w:p>
     <w:p/>
     <w:p/>
-    <w:p>
-      <w:r>
+    <w:p/>
+    <w:p/>
+    <w:p/>
+    <w:p/>
+    <w:p/>
+    <w:p/>
+    <w:p/>
+    <w:p/>
+    <w:p/>
+    <w:p>
+      <w:r>
+        <w:lastRenderedPageBreak/>
         <w:t xml:space="preserve">11 – </w:t>
       </w:r>
-    </w:p>
-    <w:p/>
+      <w:r>
+        <w:t xml:space="preserve">Apos estabelecer a comunicacao ser necessario definir </w:t>
+      </w:r>
+      <w:r>
+        <w:t>sera necessario fazer um teste para verificar a conexao, para isso podemos fazer o comando ping no CMD do computador para realizar isso. Quando estiver no computador 0, eu digito o comando ping &lt;ip do computador 1&gt; para ver se estao conectados. Quando estiver no computador 1, eu digito o controario: ping &lt;ip do computador 0&gt;. Para acessar sera necessario seguir o seguinte caminho. Menu computador -&gt; DESKTOP -&gt; Command Prompt</w:t>
+      </w:r>
+    </w:p>
+    <w:p>
+      <w:pPr>
+        <w:jc w:val="center"/>
+      </w:pPr>
+      <w:r>
+        <w:drawing>
+          <wp:inline distT="0" distB="0" distL="0" distR="0" wp14:anchorId="0D8C8431" wp14:editId="42C0E8F9">
+            <wp:extent cx="5522005" cy="4714875"/>
+            <wp:effectExtent l="0" t="0" r="2540" b="0"/>
+            <wp:docPr id="1574755962" name="Picture 1"/>
+            <wp:cNvGraphicFramePr>
+              <a:graphicFrameLocks xmlns:a="http://schemas.openxmlformats.org/drawingml/2006/main" noChangeAspect="1"/>
+            </wp:cNvGraphicFramePr>
+            <a:graphic xmlns:a="http://schemas.openxmlformats.org/drawingml/2006/main">
+              <a:graphicData uri="http://schemas.openxmlformats.org/drawingml/2006/picture">
+                <pic:pic xmlns:pic="http://schemas.openxmlformats.org/drawingml/2006/picture">
+                  <pic:nvPicPr>
+                    <pic:cNvPr id="1574755962" name=""/>
+                    <pic:cNvPicPr/>
+                  </pic:nvPicPr>
+                  <pic:blipFill>
+                    <a:blip r:embed="rId17"/>
+                    <a:stretch>
+                      <a:fillRect/>
+                    </a:stretch>
+                  </pic:blipFill>
+                  <pic:spPr>
+                    <a:xfrm>
+                      <a:off x="0" y="0"/>
+                      <a:ext cx="5547166" cy="4736358"/>
+                    </a:xfrm>
+                    <a:prstGeom prst="rect">
+                      <a:avLst/>
+                    </a:prstGeom>
+                  </pic:spPr>
+                </pic:pic>
+              </a:graphicData>
+            </a:graphic>
+          </wp:inline>
+        </w:drawing>
+      </w:r>
+    </w:p>
     <w:p>
       <w:pPr>
         <w:rPr>
@@ -1184,12 +1309,319 @@
     </w:p>
     <w:p>
       <w:pPr>
+        <w:jc w:val="center"/>
         <w:rPr>
           <w:b/>
           <w:bCs/>
         </w:rPr>
       </w:pPr>
-    </w:p>
+      <w:r>
+        <w:rPr>
+          <w:b/>
+          <w:bCs/>
+        </w:rPr>
+        <w:lastRenderedPageBreak/>
+        <w:drawing>
+          <wp:inline distT="0" distB="0" distL="0" distR="0" wp14:anchorId="2A37EA2A" wp14:editId="4092B5E8">
+            <wp:extent cx="5912258" cy="4229100"/>
+            <wp:effectExtent l="0" t="0" r="0" b="0"/>
+            <wp:docPr id="427393626" name="Picture 1"/>
+            <wp:cNvGraphicFramePr>
+              <a:graphicFrameLocks xmlns:a="http://schemas.openxmlformats.org/drawingml/2006/main" noChangeAspect="1"/>
+            </wp:cNvGraphicFramePr>
+            <a:graphic xmlns:a="http://schemas.openxmlformats.org/drawingml/2006/main">
+              <a:graphicData uri="http://schemas.openxmlformats.org/drawingml/2006/picture">
+                <pic:pic xmlns:pic="http://schemas.openxmlformats.org/drawingml/2006/picture">
+                  <pic:nvPicPr>
+                    <pic:cNvPr id="427393626" name=""/>
+                    <pic:cNvPicPr/>
+                  </pic:nvPicPr>
+                  <pic:blipFill>
+                    <a:blip r:embed="rId18"/>
+                    <a:stretch>
+                      <a:fillRect/>
+                    </a:stretch>
+                  </pic:blipFill>
+                  <pic:spPr>
+                    <a:xfrm>
+                      <a:off x="0" y="0"/>
+                      <a:ext cx="5913945" cy="4230307"/>
+                    </a:xfrm>
+                    <a:prstGeom prst="rect">
+                      <a:avLst/>
+                    </a:prstGeom>
+                  </pic:spPr>
+                </pic:pic>
+              </a:graphicData>
+            </a:graphic>
+          </wp:inline>
+        </w:drawing>
+      </w:r>
+    </w:p>
+    <w:p/>
+    <w:p/>
+    <w:p/>
+    <w:p/>
+    <w:p/>
+    <w:p/>
+    <w:p/>
+    <w:p/>
+    <w:p/>
+    <w:p/>
+    <w:p/>
+    <w:p/>
+    <w:p/>
+    <w:p/>
+    <w:p/>
+    <w:p>
+      <w:r>
+        <w:lastRenderedPageBreak/>
+        <w:t>12 – Mesma coisa mas no computador 1. Acessar o CMD, digitar o comando: ping 192.168.1.10 que esse ser o endereco ip do computador 0. Assim testando a conexao dos dois computadores enviando pacotes, para ver se chegam no computador 0 e retornam todos sem perda</w:t>
+      </w:r>
+      <w:r>
+        <w:t xml:space="preserve">. Para acessar sera necessario seguir o seguinte caminho. Menu computador </w:t>
+      </w:r>
+      <w:r>
+        <w:t>1</w:t>
+      </w:r>
+      <w:r>
+        <w:t>-&gt; DESKTOP -&gt; Command Prompt</w:t>
+      </w:r>
+    </w:p>
+    <w:p>
+      <w:pPr>
+        <w:jc w:val="center"/>
+      </w:pPr>
+      <w:r>
+        <w:drawing>
+          <wp:inline distT="0" distB="0" distL="0" distR="0" wp14:anchorId="75D2B1D0" wp14:editId="26B5F5F0">
+            <wp:extent cx="5610225" cy="5239465"/>
+            <wp:effectExtent l="0" t="0" r="0" b="0"/>
+            <wp:docPr id="429136433" name="Picture 1"/>
+            <wp:cNvGraphicFramePr>
+              <a:graphicFrameLocks xmlns:a="http://schemas.openxmlformats.org/drawingml/2006/main" noChangeAspect="1"/>
+            </wp:cNvGraphicFramePr>
+            <a:graphic xmlns:a="http://schemas.openxmlformats.org/drawingml/2006/main">
+              <a:graphicData uri="http://schemas.openxmlformats.org/drawingml/2006/picture">
+                <pic:pic xmlns:pic="http://schemas.openxmlformats.org/drawingml/2006/picture">
+                  <pic:nvPicPr>
+                    <pic:cNvPr id="429136433" name=""/>
+                    <pic:cNvPicPr/>
+                  </pic:nvPicPr>
+                  <pic:blipFill>
+                    <a:blip r:embed="rId19"/>
+                    <a:stretch>
+                      <a:fillRect/>
+                    </a:stretch>
+                  </pic:blipFill>
+                  <pic:spPr>
+                    <a:xfrm>
+                      <a:off x="0" y="0"/>
+                      <a:ext cx="5611296" cy="5240465"/>
+                    </a:xfrm>
+                    <a:prstGeom prst="rect">
+                      <a:avLst/>
+                    </a:prstGeom>
+                  </pic:spPr>
+                </pic:pic>
+              </a:graphicData>
+            </a:graphic>
+          </wp:inline>
+        </w:drawing>
+      </w:r>
+    </w:p>
+    <w:p>
+      <w:pPr>
+        <w:jc w:val="center"/>
+      </w:pPr>
+      <w:r>
+        <w:lastRenderedPageBreak/>
+        <w:drawing>
+          <wp:inline distT="0" distB="0" distL="0" distR="0" wp14:anchorId="6F573B89" wp14:editId="74D17814">
+            <wp:extent cx="5782640" cy="5048250"/>
+            <wp:effectExtent l="0" t="0" r="8890" b="0"/>
+            <wp:docPr id="2107223238" name="Picture 1"/>
+            <wp:cNvGraphicFramePr>
+              <a:graphicFrameLocks xmlns:a="http://schemas.openxmlformats.org/drawingml/2006/main" noChangeAspect="1"/>
+            </wp:cNvGraphicFramePr>
+            <a:graphic xmlns:a="http://schemas.openxmlformats.org/drawingml/2006/main">
+              <a:graphicData uri="http://schemas.openxmlformats.org/drawingml/2006/picture">
+                <pic:pic xmlns:pic="http://schemas.openxmlformats.org/drawingml/2006/picture">
+                  <pic:nvPicPr>
+                    <pic:cNvPr id="2107223238" name=""/>
+                    <pic:cNvPicPr/>
+                  </pic:nvPicPr>
+                  <pic:blipFill>
+                    <a:blip r:embed="rId20"/>
+                    <a:stretch>
+                      <a:fillRect/>
+                    </a:stretch>
+                  </pic:blipFill>
+                  <pic:spPr>
+                    <a:xfrm>
+                      <a:off x="0" y="0"/>
+                      <a:ext cx="5788084" cy="5053003"/>
+                    </a:xfrm>
+                    <a:prstGeom prst="rect">
+                      <a:avLst/>
+                    </a:prstGeom>
+                  </pic:spPr>
+                </pic:pic>
+              </a:graphicData>
+            </a:graphic>
+          </wp:inline>
+        </w:drawing>
+      </w:r>
+    </w:p>
+    <w:p>
+      <w:pPr>
+        <w:jc w:val="center"/>
+      </w:pPr>
+    </w:p>
+    <w:p/>
+    <w:p/>
+    <w:p/>
+    <w:p/>
+    <w:p/>
+    <w:p/>
+    <w:p/>
+    <w:p/>
+    <w:p/>
+    <w:p/>
+    <w:p/>
+    <w:p>
+      <w:r>
+        <w:lastRenderedPageBreak/>
+        <w:t>13- Apos isso posso colocar o mouse sobre o computador 0 e o computador 1 e verificar que ja foi gerado um IPV4 para acesso em ambos.</w:t>
+      </w:r>
+    </w:p>
+    <w:p/>
+    <w:p>
+      <w:r>
+        <w:drawing>
+          <wp:inline distT="0" distB="0" distL="0" distR="0" wp14:anchorId="7B907FEB" wp14:editId="71884272">
+            <wp:extent cx="5400040" cy="1731645"/>
+            <wp:effectExtent l="0" t="0" r="0" b="1905"/>
+            <wp:docPr id="1989511744" name="Picture 1"/>
+            <wp:cNvGraphicFramePr>
+              <a:graphicFrameLocks xmlns:a="http://schemas.openxmlformats.org/drawingml/2006/main" noChangeAspect="1"/>
+            </wp:cNvGraphicFramePr>
+            <a:graphic xmlns:a="http://schemas.openxmlformats.org/drawingml/2006/main">
+              <a:graphicData uri="http://schemas.openxmlformats.org/drawingml/2006/picture">
+                <pic:pic xmlns:pic="http://schemas.openxmlformats.org/drawingml/2006/picture">
+                  <pic:nvPicPr>
+                    <pic:cNvPr id="1989511744" name=""/>
+                    <pic:cNvPicPr/>
+                  </pic:nvPicPr>
+                  <pic:blipFill>
+                    <a:blip r:embed="rId21"/>
+                    <a:stretch>
+                      <a:fillRect/>
+                    </a:stretch>
+                  </pic:blipFill>
+                  <pic:spPr>
+                    <a:xfrm>
+                      <a:off x="0" y="0"/>
+                      <a:ext cx="5400040" cy="1731645"/>
+                    </a:xfrm>
+                    <a:prstGeom prst="rect">
+                      <a:avLst/>
+                    </a:prstGeom>
+                  </pic:spPr>
+                </pic:pic>
+              </a:graphicData>
+            </a:graphic>
+          </wp:inline>
+        </w:drawing>
+      </w:r>
+      <w:r>
+        <w:t xml:space="preserve"> </w:t>
+      </w:r>
+    </w:p>
+    <w:p>
+      <w:r>
+        <w:drawing>
+          <wp:inline distT="0" distB="0" distL="0" distR="0" wp14:anchorId="2B87FE65" wp14:editId="2A793599">
+            <wp:extent cx="5400040" cy="1802130"/>
+            <wp:effectExtent l="0" t="0" r="0" b="7620"/>
+            <wp:docPr id="546207548" name="Picture 1"/>
+            <wp:cNvGraphicFramePr>
+              <a:graphicFrameLocks xmlns:a="http://schemas.openxmlformats.org/drawingml/2006/main" noChangeAspect="1"/>
+            </wp:cNvGraphicFramePr>
+            <a:graphic xmlns:a="http://schemas.openxmlformats.org/drawingml/2006/main">
+              <a:graphicData uri="http://schemas.openxmlformats.org/drawingml/2006/picture">
+                <pic:pic xmlns:pic="http://schemas.openxmlformats.org/drawingml/2006/picture">
+                  <pic:nvPicPr>
+                    <pic:cNvPr id="546207548" name=""/>
+                    <pic:cNvPicPr/>
+                  </pic:nvPicPr>
+                  <pic:blipFill>
+                    <a:blip r:embed="rId22"/>
+                    <a:stretch>
+                      <a:fillRect/>
+                    </a:stretch>
+                  </pic:blipFill>
+                  <pic:spPr>
+                    <a:xfrm>
+                      <a:off x="0" y="0"/>
+                      <a:ext cx="5400040" cy="1802130"/>
+                    </a:xfrm>
+                    <a:prstGeom prst="rect">
+                      <a:avLst/>
+                    </a:prstGeom>
+                  </pic:spPr>
+                </pic:pic>
+              </a:graphicData>
+            </a:graphic>
+          </wp:inline>
+        </w:drawing>
+      </w:r>
+    </w:p>
+    <w:p>
+      <w:r>
+        <w:t>14 – Apos disso posso ativar a simulacao e realizar um teste de mensageria para verificar o que sera enviado e recebido entre os computadores</w:t>
+      </w:r>
+    </w:p>
+    <w:p>
+      <w:r>
+        <w:drawing>
+          <wp:inline distT="0" distB="0" distL="0" distR="0" wp14:anchorId="5BD8CE64" wp14:editId="60C8BA6D">
+            <wp:extent cx="5400040" cy="2420620"/>
+            <wp:effectExtent l="0" t="0" r="0" b="0"/>
+            <wp:docPr id="1104819218" name="Picture 1"/>
+            <wp:cNvGraphicFramePr>
+              <a:graphicFrameLocks xmlns:a="http://schemas.openxmlformats.org/drawingml/2006/main" noChangeAspect="1"/>
+            </wp:cNvGraphicFramePr>
+            <a:graphic xmlns:a="http://schemas.openxmlformats.org/drawingml/2006/main">
+              <a:graphicData uri="http://schemas.openxmlformats.org/drawingml/2006/picture">
+                <pic:pic xmlns:pic="http://schemas.openxmlformats.org/drawingml/2006/picture">
+                  <pic:nvPicPr>
+                    <pic:cNvPr id="1104819218" name=""/>
+                    <pic:cNvPicPr/>
+                  </pic:nvPicPr>
+                  <pic:blipFill>
+                    <a:blip r:embed="rId23"/>
+                    <a:stretch>
+                      <a:fillRect/>
+                    </a:stretch>
+                  </pic:blipFill>
+                  <pic:spPr>
+                    <a:xfrm>
+                      <a:off x="0" y="0"/>
+                      <a:ext cx="5400040" cy="2420620"/>
+                    </a:xfrm>
+                    <a:prstGeom prst="rect">
+                      <a:avLst/>
+                    </a:prstGeom>
+                  </pic:spPr>
+                </pic:pic>
+              </a:graphicData>
+            </a:graphic>
+          </wp:inline>
+        </w:drawing>
+      </w:r>
+    </w:p>
+    <w:p/>
     <w:p>
       <w:r>
         <w:br w:type="page"/>

</xml_diff>